<commit_message>
Syllabus B1 Mastery 4H: el orden de los bloques lo fija coordinacion; PASE del bloque que termina al que empieza
Co-Authored-By: Claude Fable 5.1 <noreply@anthropic.com>
</commit_message>
<xml_diff>
--- a/VERSION_2/B1_4H/SYLLABUS_B1_MASTERY_4H.docx
+++ b/VERSION_2/B1_4H/SYLLABUS_B1_MASTERY_4H.docx
@@ -65,7 +65,7 @@
           <w:b w:val="0"/>
           <w:sz w:val="20"/>
         </w:rPr>
-        <w:t>Cada día de B1 Mastery son DOS clases seguidas de 110 minutos, con dos docentes distintos y una pausa entre ellas. Conversación va primero, Gramática va segundo, siempre en ese orden, y cada docente recibe únicamente la guia de su pista.</w:t>
+        <w:t>Cada día de B1 Mastery son DOS clases seguidas de 110 minutos, con dos docentes distintos y una pausa entre ellas. El orden de los dos bloques lo fija coordinación para cada cohorte (en el diseño base Conversación va primero; si un cohorte arranca con Gramática, el PASE va del bloque que termina al que empieza y lo que la guía llama "esta mañana" se lee "ayer"). Cada docente recibe únicamente la guia de su pista.</w:t>
       </w:r>
     </w:p>
     <w:tbl>
@@ -205,7 +205,7 @@
               <w:rPr>
                 <w:sz w:val="19"/>
               </w:rPr>
-              <w:t>PRIMERO: las 2 primeras horas</w:t>
+              <w:t>2 horas (el orden lo fija coordinación)</w:t>
             </w:r>
           </w:p>
         </w:tc>
@@ -273,7 +273,7 @@
               <w:rPr>
                 <w:sz w:val="19"/>
               </w:rPr>
-              <w:t>SEGUNDO: las 2 últimas horas del mismo día</w:t>
+              <w:t>2 horas, el mismo día</w:t>
             </w:r>
           </w:p>
         </w:tc>
@@ -289,7 +289,7 @@
               <w:rPr>
                 <w:sz w:val="19"/>
               </w:rPr>
-              <w:t>Sella EN PAPEL lo que salió oral esa mañana: regla del libro citada en el tablero, drill, ejercicio escrito y una simulación DISTINTA. Bloques 1 a 3 DE PIE: piso 70%, validado en 86%.</w:t>
+              <w:t>Sella EN PAPEL lo que salió oral en Conversación (ese día o el anterior, según el orden): regla del libro citada en el tablero, drill, ejercicio escrito y una simulación DISTINTA. Bloques 1 a 3 DE PIE: piso 70%, validado en 86%.</w:t>
             </w:r>
           </w:p>
         </w:tc>
@@ -330,13 +330,13 @@
           <w:b/>
           <w:sz w:val="20"/>
         </w:rPr>
-        <w:t xml:space="preserve">• Conversación → Gramática, el mismo día: </w:t>
+        <w:t xml:space="preserve">• Conversación → Gramática: </w:t>
       </w:r>
       <w:r>
         <w:rPr>
           <w:sz w:val="20"/>
         </w:rPr>
-        <w:t>al terminar su bloque, el docente de Conversación escribe el PASE en 3 líneas — lo que salió bien, los 3 errores más repetidos y qué quedó pendiente del módulo — y lo manda por el grupo antes de la pausa. Gramática lo lee antes de entrar y abre con eso: "esto salió de sus bocas esta mañana; ahora lo sellamos en papel".</w:t>
+        <w:t>al terminar su bloque, el docente de Conversación escribe el PASE en 3 líneas — lo que salió bien, los 3 errores más repetidos y qué quedó pendiente del módulo — y lo manda por el grupo al terminar. Gramática lo lee antes de entrar a su siguiente bloque y abre con eso: "esto salió de sus bocas en Conversación; ahora lo sellamos en papel".</w:t>
       </w:r>
     </w:p>
     <w:p>
@@ -349,13 +349,13 @@
           <w:b/>
           <w:sz w:val="20"/>
         </w:rPr>
-        <w:t xml:space="preserve">• Gramática → Conversación, para el día siguiente: </w:t>
+        <w:t xml:space="preserve">• Gramática → Conversación: </w:t>
       </w:r>
       <w:r>
         <w:rPr>
           <w:sz w:val="20"/>
         </w:rPr>
-        <w:t>al cerrar la jornada, Gramática devuelve el PASE — qué quedó sellado y qué sigue frágil — y con eso Conversación abre la mañana siguiente. Si el PASE va en una sola dirección, no está funcionando.</w:t>
+        <w:t>al cerrar su bloque, Gramática devuelve el PASE — qué quedó sellado y qué sigue frágil — y con eso Conversación abre su siguiente bloque (el mismo día si Gramática va primero; la mañana siguiente si va segunda). Si el PASE va en una sola dirección, no está funcionando.</w:t>
       </w:r>
     </w:p>
     <w:p>
@@ -425,7 +425,7 @@
         <w:rPr>
           <w:sz w:val="20"/>
         </w:rPr>
-        <w:t>el docente de Conversación, que va primero graba a cada estudiante 1 a 2 minutos hablando, mientras el resto trabaja. Es la foto de partida del nivel para la garantía. Esa misma noche se las envía a la auxiliar administrativa por WhatsApp, una por una con el nombre, y ella las guarda en el computador de la academia. Al que no quede grabado en la Clase 1 (llegó tarde, se fue antes) o entre después como estudiante nuevo, se le graba en la primera clase a la que asista, ese mismo día: ningún estudiante queda sin grabación de entrada.</w:t>
+        <w:t>el docente de Conversación, en la Clase 1 de su pista graba a cada estudiante 1 a 2 minutos hablando, mientras el resto trabaja. Es la foto de partida del nivel para la garantía. Esa misma noche se las envía a la auxiliar administrativa por WhatsApp, una por una con el nombre, y ella las guarda en el computador de la academia. Al que no quede grabado en la Clase 1 (llegó tarde, se fue antes) o entre después como estudiante nuevo, se le graba en la primera clase a la que asista, ese mismo día: ningún estudiante queda sin grabación de entrada.</w:t>
       </w:r>
     </w:p>
     <w:p>

</xml_diff>